<commit_message>
New front-end pages and backend for those pages
</commit_message>
<xml_diff>
--- a/docs/Transporter Delivery Tracking Project Plan.docx
+++ b/docs/Transporter Delivery Tracking Project Plan.docx
@@ -27,6 +27,13 @@
     </w:p>
     <w:sdt>
       <w:sdtPr>
+        <w:rPr>
+          <w:rFonts w:asciiTheme="minorHAnsi" w:eastAsiaTheme="minorHAnsi" w:hAnsiTheme="minorHAnsi" w:cstheme="minorBidi"/>
+          <w:color w:val="auto"/>
+          <w:sz w:val="22"/>
+          <w:szCs w:val="22"/>
+          <w:lang w:val="en-ZA"/>
+        </w:rPr>
         <w:id w:val="-1427948477"/>
         <w:docPartObj>
           <w:docPartGallery w:val="Table of Contents"/>
@@ -35,14 +42,9 @@
       </w:sdtPr>
       <w:sdtEndPr>
         <w:rPr>
-          <w:rFonts w:asciiTheme="minorHAnsi" w:eastAsiaTheme="minorHAnsi" w:hAnsiTheme="minorHAnsi" w:cstheme="minorBidi"/>
           <w:b/>
           <w:bCs/>
           <w:noProof/>
-          <w:color w:val="auto"/>
-          <w:sz w:val="22"/>
-          <w:szCs w:val="22"/>
-          <w:lang w:val="en-ZA"/>
         </w:rPr>
       </w:sdtEndPr>
       <w:sdtContent>
@@ -1248,13 +1250,7 @@
         <w:rPr>
           <w:lang w:val="en-US"/>
         </w:rPr>
-        <w:t xml:space="preserve"> </w:t>
-      </w:r>
-      <w:r>
-        <w:rPr>
-          <w:lang w:val="en-US"/>
-        </w:rPr>
-        <w:t>Driver assignment workflow</w:t>
+        <w:t xml:space="preserve"> Driver assignment workflow</w:t>
       </w:r>
     </w:p>
     <w:p>
@@ -1289,13 +1285,7 @@
         <w:rPr>
           <w:lang w:val="en-US"/>
         </w:rPr>
-        <w:t xml:space="preserve"> </w:t>
-      </w:r>
-      <w:r>
-        <w:rPr>
-          <w:lang w:val="en-US"/>
-        </w:rPr>
-        <w:t>Status timeline</w:t>
+        <w:t xml:space="preserve"> Status timeline</w:t>
       </w:r>
     </w:p>
     <w:p>
@@ -1330,13 +1320,7 @@
         <w:rPr>
           <w:lang w:val="en-US"/>
         </w:rPr>
-        <w:t xml:space="preserve"> </w:t>
-      </w:r>
-      <w:r>
-        <w:rPr>
-          <w:lang w:val="en-US"/>
-        </w:rPr>
-        <w:t>Public tracking page</w:t>
+        <w:t xml:space="preserve"> Public tracking page</w:t>
       </w:r>
     </w:p>
     <w:p>
@@ -1371,13 +1355,7 @@
         <w:rPr>
           <w:lang w:val="en-US"/>
         </w:rPr>
-        <w:t xml:space="preserve"> </w:t>
-      </w:r>
-      <w:r>
-        <w:rPr>
-          <w:lang w:val="en-US"/>
-        </w:rPr>
-        <w:t>Leaflet.js route map</w:t>
+        <w:t xml:space="preserve"> Leaflet.js route map</w:t>
       </w:r>
     </w:p>
     <w:p>
@@ -1412,13 +1390,7 @@
         <w:rPr>
           <w:lang w:val="en-US"/>
         </w:rPr>
-        <w:t xml:space="preserve"> </w:t>
-      </w:r>
-      <w:r>
-        <w:rPr>
-          <w:lang w:val="en-US"/>
-        </w:rPr>
-        <w:t>Email notifications</w:t>
+        <w:t xml:space="preserve"> Email notifications</w:t>
       </w:r>
     </w:p>
     <w:p>
@@ -1453,13 +1425,7 @@
         <w:rPr>
           <w:lang w:val="en-US"/>
         </w:rPr>
-        <w:t xml:space="preserve"> </w:t>
-      </w:r>
-      <w:r>
-        <w:rPr>
-          <w:lang w:val="en-US"/>
-        </w:rPr>
-        <w:t>Driver mobile view</w:t>
+        <w:t xml:space="preserve"> Driver mobile view</w:t>
       </w:r>
     </w:p>
     <w:p>
@@ -1494,13 +1460,7 @@
         <w:rPr>
           <w:lang w:val="en-US"/>
         </w:rPr>
-        <w:t xml:space="preserve"> </w:t>
-      </w:r>
-      <w:r>
-        <w:rPr>
-          <w:lang w:val="en-US"/>
-        </w:rPr>
-        <w:t>Deployed application URL</w:t>
+        <w:t xml:space="preserve"> Deployed application URL</w:t>
       </w:r>
     </w:p>
     <w:p>
@@ -1535,13 +1495,7 @@
         <w:rPr>
           <w:lang w:val="en-US"/>
         </w:rPr>
-        <w:t xml:space="preserve"> </w:t>
-      </w:r>
-      <w:r>
-        <w:rPr>
-          <w:lang w:val="en-US"/>
-        </w:rPr>
-        <w:t>README + Demo video</w:t>
+        <w:t xml:space="preserve"> README + Demo video</w:t>
       </w:r>
     </w:p>
     <w:p>
@@ -3755,6 +3709,7 @@
   <w:style w:type="character" w:default="1" w:styleId="DefaultParagraphFont">
     <w:name w:val="Default Paragraph Font"/>
     <w:uiPriority w:val="1"/>
+    <w:semiHidden/>
     <w:unhideWhenUsed/>
   </w:style>
   <w:style w:type="table" w:default="1" w:styleId="TableNormal">

</xml_diff>